<commit_message>
feat(main): added files stage04
</commit_message>
<xml_diff>
--- a/project-group/stage04/report/_output/mathmod-project-group-stage04-report.docx
+++ b/project-group/stage04/report/_output/mathmod-project-group-stage04-report.docx
@@ -731,10 +731,10 @@
               <w:tblLook w:firstRow="1" w:lastRow="0" w:firstColumn="0" w:lastColumn="0" w:noHBand="0" w:noVBand="0" w:val="0020"/>
             </w:tblPr>
             <w:tblGrid>
-              <w:gridCol w:w="1005"/>
-              <w:gridCol w:w="1885"/>
-              <w:gridCol w:w="2011"/>
-              <w:gridCol w:w="3017"/>
+              <w:gridCol w:w="2671"/>
+              <w:gridCol w:w="1431"/>
+              <w:gridCol w:w="1526"/>
+              <w:gridCol w:w="2290"/>
             </w:tblGrid>
             <w:tr>
               <w:trPr>
@@ -2035,11 +2035,17 @@
       <w:r>
         <w:t xml:space="preserve">:</w:t>
       </w:r>
-      <w:r>
-        <w:t xml:space="preserve"> </w:t>
-      </w:r>
-      <w:r>
-        <w:t xml:space="preserve">- Объектно-ориентированная архитектура с наследованием (класс</w:t>
+    </w:p>
+    <w:p>
+      <w:pPr>
+        <w:pStyle w:val="Compact"/>
+        <w:numPr>
+          <w:ilvl w:val="0"/>
+          <w:numId w:val="1004"/>
+        </w:numPr>
+      </w:pPr>
+      <w:r>
+        <w:t xml:space="preserve">Объектно-ориентированная архитектура с наследованием (класс</w:t>
       </w:r>
       <w:r>
         <w:t xml:space="preserve"> </w:t>
@@ -2071,11 +2077,17 @@
       <w:r>
         <w:t xml:space="preserve">без дублирования кода).</w:t>
       </w:r>
-      <w:r>
-        <w:t xml:space="preserve"> </w:t>
-      </w:r>
-      <w:r>
-        <w:t xml:space="preserve">- Два независимых метода вычисления</w:t>
+    </w:p>
+    <w:p>
+      <w:pPr>
+        <w:pStyle w:val="Compact"/>
+        <w:numPr>
+          <w:ilvl w:val="0"/>
+          <w:numId w:val="1004"/>
+        </w:numPr>
+      </w:pPr>
+      <w:r>
+        <w:t xml:space="preserve">Два независимых метода вычисления</w:t>
       </w:r>
       <w:r>
         <w:t xml:space="preserve"> </w:t>
@@ -2091,16 +2103,22 @@
       <w:r>
         <w:t xml:space="preserve">верифицируют результаты.</w:t>
       </w:r>
-      <w:r>
-        <w:t xml:space="preserve"> </w:t>
-      </w:r>
-      <w:r>
-        <w:t xml:space="preserve">- Охват четырёх принципиально разных физических моделей позволил провести содержательное сравнение.</w:t>
-      </w:r>
-    </w:p>
-    <w:p>
-      <w:pPr>
-        <w:pStyle w:val="BodyText"/>
+    </w:p>
+    <w:p>
+      <w:pPr>
+        <w:pStyle w:val="Compact"/>
+        <w:numPr>
+          <w:ilvl w:val="0"/>
+          <w:numId w:val="1004"/>
+        </w:numPr>
+      </w:pPr>
+      <w:r>
+        <w:t xml:space="preserve">Охват четырёх принципиально разных физических моделей позволил провести содержательное сравнение.</w:t>
+      </w:r>
+    </w:p>
+    <w:p>
+      <w:pPr>
+        <w:pStyle w:val="FirstParagraph"/>
       </w:pPr>
       <w:r>
         <w:rPr>
@@ -2112,23 +2130,41 @@
       <w:r>
         <w:t xml:space="preserve">:</w:t>
       </w:r>
-      <w:r>
-        <w:t xml:space="preserve"> </w:t>
-      </w:r>
-      <w:r>
-        <w:t xml:space="preserve">- Отсутствие статистического усреднения снижает достоверность.</w:t>
-      </w:r>
-      <w:r>
-        <w:t xml:space="preserve"> </w:t>
-      </w:r>
-      <w:r>
-        <w:t xml:space="preserve">- Производительность чистого Python-цикла ограничивает размер кластеров.</w:t>
-      </w:r>
-      <w:r>
-        <w:t xml:space="preserve"> </w:t>
-      </w:r>
-      <w:r>
-        <w:t xml:space="preserve">- Линейный поиск в бессеточной модели делает её непригодной при</w:t>
+    </w:p>
+    <w:p>
+      <w:pPr>
+        <w:pStyle w:val="Compact"/>
+        <w:numPr>
+          <w:ilvl w:val="0"/>
+          <w:numId w:val="1005"/>
+        </w:numPr>
+      </w:pPr>
+      <w:r>
+        <w:t xml:space="preserve">Отсутствие статистического усреднения снижает достоверность.</w:t>
+      </w:r>
+    </w:p>
+    <w:p>
+      <w:pPr>
+        <w:pStyle w:val="Compact"/>
+        <w:numPr>
+          <w:ilvl w:val="0"/>
+          <w:numId w:val="1005"/>
+        </w:numPr>
+      </w:pPr>
+      <w:r>
+        <w:t xml:space="preserve">Производительность чистого Python-цикла ограничивает размер кластеров.</w:t>
+      </w:r>
+    </w:p>
+    <w:p>
+      <w:pPr>
+        <w:pStyle w:val="Compact"/>
+        <w:numPr>
+          <w:ilvl w:val="0"/>
+          <w:numId w:val="1005"/>
+        </w:numPr>
+      </w:pPr>
+      <w:r>
+        <w:t xml:space="preserve">Линейный поиск в бессеточной модели делает её непригодной при</w:t>
       </w:r>
       <w:r>
         <w:t xml:space="preserve"> </w:t>
@@ -2153,7 +2189,7 @@
     </w:p>
     <w:p>
       <w:pPr>
-        <w:pStyle w:val="BodyText"/>
+        <w:pStyle w:val="FirstParagraph"/>
       </w:pPr>
       <w:r>
         <w:rPr>
@@ -2163,7 +2199,7 @@
         <w:t xml:space="preserve">Групповая динамика</w:t>
       </w:r>
       <w:r>
-        <w:t xml:space="preserve">: распределение ролей по этапам (теория → алгоритмы → программирование → анализ) оказалось органичным и позволило эффективно интегрировать результаты на финальном этапе.</w:t>
+        <w:t xml:space="preserve">: распределение ролей по этапам (теория -&gt; алгоритмы -&gt; программирование -&gt; анализ) оказалось органичным и позволило эффективно интегрировать результаты на финальном этапе.</w:t>
       </w:r>
     </w:p>
     <w:bookmarkEnd w:id="32"/>
@@ -2217,7 +2253,7 @@
         <w:pStyle w:val="Compact"/>
         <w:numPr>
           <w:ilvl w:val="0"/>
-          <w:numId w:val="1004"/>
+          <w:numId w:val="1006"/>
         </w:numPr>
       </w:pPr>
       <w:r>
@@ -2229,7 +2265,7 @@
         <w:pStyle w:val="Compact"/>
         <w:numPr>
           <w:ilvl w:val="0"/>
-          <w:numId w:val="1004"/>
+          <w:numId w:val="1006"/>
         </w:numPr>
       </w:pPr>
       <w:r>
@@ -2241,7 +2277,7 @@
         <w:pStyle w:val="Compact"/>
         <w:numPr>
           <w:ilvl w:val="0"/>
-          <w:numId w:val="1004"/>
+          <w:numId w:val="1006"/>
         </w:numPr>
       </w:pPr>
       <w:r>
@@ -2253,7 +2289,7 @@
         <w:pStyle w:val="Compact"/>
         <w:numPr>
           <w:ilvl w:val="0"/>
-          <w:numId w:val="1004"/>
+          <w:numId w:val="1006"/>
         </w:numPr>
       </w:pPr>
       <w:r>
@@ -2348,7 +2384,7 @@
         <w:pStyle w:val="Compact"/>
         <w:numPr>
           <w:ilvl w:val="0"/>
-          <w:numId w:val="1004"/>
+          <w:numId w:val="1006"/>
         </w:numPr>
       </w:pPr>
       <w:r>
@@ -2369,29 +2405,53 @@
       <w:r>
         <w:t xml:space="preserve">:</w:t>
       </w:r>
-      <w:r>
-        <w:t xml:space="preserve"> </w:t>
-      </w:r>
-      <w:r>
-        <w:t xml:space="preserve">- расширение до трёхмерных кластеров;</w:t>
-      </w:r>
-      <w:r>
-        <w:t xml:space="preserve"> </w:t>
-      </w:r>
-      <w:r>
-        <w:t xml:space="preserve">- реализация параллельных вычислений;</w:t>
-      </w:r>
-      <w:r>
-        <w:t xml:space="preserve"> </w:t>
-      </w:r>
-      <w:r>
-        <w:t xml:space="preserve">- сравнение с экспериментальными данными (коллоидные агрегаты, электроосаждение);</w:t>
-      </w:r>
-      <w:r>
-        <w:t xml:space="preserve"> </w:t>
-      </w:r>
-      <w:r>
-        <w:t xml:space="preserve">- добавление статистического усреднения и доверительных интервалов для оценок</w:t>
+    </w:p>
+    <w:p>
+      <w:pPr>
+        <w:pStyle w:val="Compact"/>
+        <w:numPr>
+          <w:ilvl w:val="0"/>
+          <w:numId w:val="1007"/>
+        </w:numPr>
+      </w:pPr>
+      <w:r>
+        <w:t xml:space="preserve">расширение до трёхмерных кластеров;</w:t>
+      </w:r>
+    </w:p>
+    <w:p>
+      <w:pPr>
+        <w:pStyle w:val="Compact"/>
+        <w:numPr>
+          <w:ilvl w:val="0"/>
+          <w:numId w:val="1007"/>
+        </w:numPr>
+      </w:pPr>
+      <w:r>
+        <w:t xml:space="preserve">реализация параллельных вычислений;</w:t>
+      </w:r>
+    </w:p>
+    <w:p>
+      <w:pPr>
+        <w:pStyle w:val="Compact"/>
+        <w:numPr>
+          <w:ilvl w:val="0"/>
+          <w:numId w:val="1007"/>
+        </w:numPr>
+      </w:pPr>
+      <w:r>
+        <w:t xml:space="preserve">сравнение с экспериментальными данными (коллоидные агрегаты, электроосаждение);</w:t>
+      </w:r>
+    </w:p>
+    <w:p>
+      <w:pPr>
+        <w:pStyle w:val="Compact"/>
+        <w:numPr>
+          <w:ilvl w:val="0"/>
+          <w:numId w:val="1007"/>
+        </w:numPr>
+      </w:pPr>
+      <w:r>
+        <w:t xml:space="preserve">добавление статистического усреднения и доверительных интервалов для оценок</w:t>
       </w:r>
       <w:r>
         <w:t xml:space="preserve"> </w:t>
@@ -2874,6 +2934,15 @@
     </w:lvlOverride>
   </w:num>
   <w:num w:numId="1004">
+    <w:abstractNumId w:val="991"/>
+  </w:num>
+  <w:num w:numId="1005">
+    <w:abstractNumId w:val="991"/>
+  </w:num>
+  <w:num w:numId="1006">
+    <w:abstractNumId w:val="991"/>
+  </w:num>
+  <w:num w:numId="1007">
     <w:abstractNumId w:val="991"/>
   </w:num>
 </w:numbering>

</xml_diff>